<commit_message>
finalize push ui and add deactivate flow
</commit_message>
<xml_diff>
--- a/Beschreibung-Spielapp-ideen.docx
+++ b/Beschreibung-Spielapp-ideen.docx
@@ -39,21 +39,7 @@
         <w:rPr>
           <w:rFonts w:ascii="Arial" w:hAnsi="Arial" w:cs="Arial"/>
         </w:rPr>
-        <w:t xml:space="preserve"> spieltag-Spiel </w:t>
-      </w:r>
-      <w:proofErr w:type="gramStart"/>
-      <w:r>
-        <w:rPr>
-          <w:rFonts w:ascii="Arial" w:hAnsi="Arial" w:cs="Arial"/>
-        </w:rPr>
-        <w:t>anlegen .</w:t>
-      </w:r>
-      <w:proofErr w:type="gramEnd"/>
-      <w:r>
-        <w:rPr>
-          <w:rFonts w:ascii="Arial" w:hAnsi="Arial" w:cs="Arial"/>
-        </w:rPr>
-        <w:t xml:space="preserve"> welche </w:t>
+        <w:t xml:space="preserve"> spieltag-Spiel anlegen . welche </w:t>
       </w:r>
       <w:proofErr w:type="spellStart"/>
       <w:r>
@@ -67,56 +53,140 @@
         <w:rPr>
           <w:rFonts w:ascii="Arial" w:hAnsi="Arial" w:cs="Arial"/>
         </w:rPr>
+        <w:t xml:space="preserve"> müssen zur </w:t>
+      </w:r>
+      <w:proofErr w:type="spellStart"/>
+      <w:r>
+        <w:rPr>
+          <w:rFonts w:ascii="Arial" w:hAnsi="Arial" w:cs="Arial"/>
+        </w:rPr>
+        <w:t>auswahl</w:t>
+      </w:r>
+      <w:proofErr w:type="spellEnd"/>
+      <w:r>
+        <w:rPr>
+          <w:rFonts w:ascii="Arial" w:hAnsi="Arial" w:cs="Arial"/>
+        </w:rPr>
+        <w:t xml:space="preserve"> sein Spielart </w:t>
+      </w:r>
+      <w:proofErr w:type="spellStart"/>
+      <w:r>
+        <w:rPr>
+          <w:rFonts w:ascii="Arial" w:hAnsi="Arial" w:cs="Arial"/>
+        </w:rPr>
+        <w:t>Freunschaftsspiel</w:t>
+      </w:r>
+      <w:proofErr w:type="spellEnd"/>
+      <w:r>
+        <w:rPr>
+          <w:rFonts w:ascii="Arial" w:hAnsi="Arial" w:cs="Arial"/>
+        </w:rPr>
+        <w:t xml:space="preserve"> Vorbereitungsspiel Meisterschaftsspiel Turnier </w:t>
+      </w:r>
+      <w:proofErr w:type="spellStart"/>
+      <w:r>
+        <w:rPr>
+          <w:rFonts w:ascii="Arial" w:hAnsi="Arial" w:cs="Arial"/>
+        </w:rPr>
+        <w:t>ect.</w:t>
+      </w:r>
+      <w:proofErr w:type="spellEnd"/>
+      <w:r>
+        <w:rPr>
+          <w:rFonts w:ascii="Arial" w:hAnsi="Arial" w:cs="Arial"/>
+        </w:rPr>
+        <w:t xml:space="preserve"> Spielgegner , </w:t>
+      </w:r>
+      <w:proofErr w:type="spellStart"/>
+      <w:r>
+        <w:rPr>
+          <w:rFonts w:ascii="Arial" w:hAnsi="Arial" w:cs="Arial"/>
+        </w:rPr>
+        <w:t>heimspiel</w:t>
+      </w:r>
+      <w:proofErr w:type="spellEnd"/>
+      <w:r>
+        <w:rPr>
+          <w:rFonts w:ascii="Arial" w:hAnsi="Arial" w:cs="Arial"/>
+        </w:rPr>
         <w:t xml:space="preserve"> </w:t>
       </w:r>
-      <w:proofErr w:type="gramStart"/>
-      <w:r>
-        <w:rPr>
-          <w:rFonts w:ascii="Arial" w:hAnsi="Arial" w:cs="Arial"/>
-        </w:rPr>
-        <w:t>müssen</w:t>
-      </w:r>
-      <w:proofErr w:type="gramEnd"/>
-      <w:r>
-        <w:rPr>
-          <w:rFonts w:ascii="Arial" w:hAnsi="Arial" w:cs="Arial"/>
-        </w:rPr>
-        <w:t xml:space="preserve"> zur </w:t>
-      </w:r>
-      <w:proofErr w:type="spellStart"/>
-      <w:r>
-        <w:rPr>
-          <w:rFonts w:ascii="Arial" w:hAnsi="Arial" w:cs="Arial"/>
-        </w:rPr>
-        <w:t>auswahl</w:t>
-      </w:r>
-      <w:proofErr w:type="spellEnd"/>
-      <w:r>
-        <w:rPr>
-          <w:rFonts w:ascii="Arial" w:hAnsi="Arial" w:cs="Arial"/>
-        </w:rPr>
-        <w:t xml:space="preserve"> sein Spielart </w:t>
-      </w:r>
-      <w:proofErr w:type="spellStart"/>
-      <w:r>
-        <w:rPr>
-          <w:rFonts w:ascii="Arial" w:hAnsi="Arial" w:cs="Arial"/>
-        </w:rPr>
-        <w:t>Freunschaftsspiel</w:t>
-      </w:r>
-      <w:proofErr w:type="spellEnd"/>
-      <w:r>
-        <w:rPr>
-          <w:rFonts w:ascii="Arial" w:hAnsi="Arial" w:cs="Arial"/>
-        </w:rPr>
-        <w:t xml:space="preserve"> Vorbereitungsspiel Meisterschaftsspiel Turnier </w:t>
-      </w:r>
-      <w:proofErr w:type="spellStart"/>
-      <w:r>
-        <w:rPr>
-          <w:rFonts w:ascii="Arial" w:hAnsi="Arial" w:cs="Arial"/>
-        </w:rPr>
-        <w:t>ect.</w:t>
+      <w:proofErr w:type="spellStart"/>
+      <w:r>
+        <w:rPr>
+          <w:rFonts w:ascii="Arial" w:hAnsi="Arial" w:cs="Arial"/>
+        </w:rPr>
+        <w:t>auswärtsspiel</w:t>
+      </w:r>
+      <w:proofErr w:type="spellEnd"/>
+      <w:r>
+        <w:rPr>
+          <w:rFonts w:ascii="Arial" w:hAnsi="Arial" w:cs="Arial"/>
+        </w:rPr>
+        <w:t xml:space="preserve"> je nachdem muss </w:t>
+      </w:r>
+      <w:proofErr w:type="spellStart"/>
+      <w:r>
+        <w:rPr>
+          <w:rFonts w:ascii="Arial" w:hAnsi="Arial" w:cs="Arial"/>
+        </w:rPr>
+        <w:t>mannschaft</w:t>
+      </w:r>
+      <w:proofErr w:type="spellEnd"/>
+      <w:r>
+        <w:rPr>
+          <w:rFonts w:ascii="Arial" w:hAnsi="Arial" w:cs="Arial"/>
+        </w:rPr>
+        <w:t xml:space="preserve"> links oder rechts stehen Heim links auswärts rechts Spielort Uhrzeit beginn und Uhrzeit für </w:t>
+      </w:r>
+      <w:proofErr w:type="spellStart"/>
+      <w:r>
+        <w:rPr>
+          <w:rFonts w:ascii="Arial" w:hAnsi="Arial" w:cs="Arial"/>
+        </w:rPr>
+        <w:t>treffpunkt</w:t>
+      </w:r>
+      <w:proofErr w:type="spellEnd"/>
+      <w:r>
+        <w:rPr>
+          <w:rFonts w:ascii="Arial" w:hAnsi="Arial" w:cs="Arial"/>
+        </w:rPr>
+        <w:t xml:space="preserve"> Diese </w:t>
+      </w:r>
+      <w:proofErr w:type="spellStart"/>
+      <w:r>
+        <w:rPr>
+          <w:rFonts w:ascii="Arial" w:hAnsi="Arial" w:cs="Arial"/>
+        </w:rPr>
+        <w:t>auswahlmöglichkeiten</w:t>
+      </w:r>
+      <w:proofErr w:type="spellEnd"/>
+      <w:r>
+        <w:rPr>
+          <w:rFonts w:ascii="Arial" w:hAnsi="Arial" w:cs="Arial"/>
+        </w:rPr>
+        <w:t xml:space="preserve"> sollen dann in </w:t>
+      </w:r>
+      <w:proofErr w:type="spellStart"/>
+      <w:r>
+        <w:rPr>
+          <w:rFonts w:ascii="Arial" w:hAnsi="Arial" w:cs="Arial"/>
+        </w:rPr>
+        <w:t>spielplan</w:t>
+      </w:r>
+      <w:proofErr w:type="spellEnd"/>
+      <w:r>
+        <w:rPr>
+          <w:rFonts w:ascii="Arial" w:hAnsi="Arial" w:cs="Arial"/>
+        </w:rPr>
+        <w:t xml:space="preserve"> gespeichert werden Treffpunkt ist nur für Rolle </w:t>
+      </w:r>
+      <w:proofErr w:type="spellStart"/>
+      <w:r>
+        <w:rPr>
+          <w:rFonts w:ascii="Arial" w:hAnsi="Arial" w:cs="Arial"/>
+        </w:rPr>
+        <w:t>eltern</w:t>
       </w:r>
       <w:proofErr w:type="spellEnd"/>
       <w:r>
@@ -125,14 +195,14 @@
         </w:rPr>
         <w:t xml:space="preserve"> </w:t>
       </w:r>
-      <w:proofErr w:type="gramStart"/>
-      <w:r>
-        <w:rPr>
-          <w:rFonts w:ascii="Arial" w:hAnsi="Arial" w:cs="Arial"/>
-        </w:rPr>
-        <w:t>Spielgegner ,</w:t>
-      </w:r>
-      <w:proofErr w:type="gramEnd"/>
+      <w:proofErr w:type="spellStart"/>
+      <w:r>
+        <w:rPr>
+          <w:rFonts w:ascii="Arial" w:hAnsi="Arial" w:cs="Arial"/>
+        </w:rPr>
+        <w:t>undRolle</w:t>
+      </w:r>
+      <w:proofErr w:type="spellEnd"/>
       <w:r>
         <w:rPr>
           <w:rFonts w:ascii="Arial" w:hAnsi="Arial" w:cs="Arial"/>
@@ -144,42 +214,28 @@
         <w:rPr>
           <w:rFonts w:ascii="Arial" w:hAnsi="Arial" w:cs="Arial"/>
         </w:rPr>
-        <w:t>heimspiel</w:t>
-      </w:r>
-      <w:proofErr w:type="spellEnd"/>
-      <w:r>
-        <w:rPr>
-          <w:rFonts w:ascii="Arial" w:hAnsi="Arial" w:cs="Arial"/>
-        </w:rPr>
-        <w:t xml:space="preserve"> </w:t>
-      </w:r>
-      <w:proofErr w:type="spellStart"/>
-      <w:r>
-        <w:rPr>
-          <w:rFonts w:ascii="Arial" w:hAnsi="Arial" w:cs="Arial"/>
-        </w:rPr>
-        <w:t>auswärtsspiel</w:t>
-      </w:r>
-      <w:proofErr w:type="spellEnd"/>
-      <w:r>
-        <w:rPr>
-          <w:rFonts w:ascii="Arial" w:hAnsi="Arial" w:cs="Arial"/>
-        </w:rPr>
-        <w:t xml:space="preserve"> je nachdem muss </w:t>
-      </w:r>
-      <w:proofErr w:type="spellStart"/>
-      <w:r>
-        <w:rPr>
-          <w:rFonts w:ascii="Arial" w:hAnsi="Arial" w:cs="Arial"/>
-        </w:rPr>
-        <w:t>mannschaft</w:t>
-      </w:r>
-      <w:proofErr w:type="spellEnd"/>
-      <w:r>
-        <w:rPr>
-          <w:rFonts w:ascii="Arial" w:hAnsi="Arial" w:cs="Arial"/>
-        </w:rPr>
-        <w:t xml:space="preserve"> links oder rechts stehen Heim links auswärts rechts Spielort Uhrzeit beginn und Uhrzeit für </w:t>
+        <w:t>spieler</w:t>
+      </w:r>
+      <w:proofErr w:type="spellEnd"/>
+      <w:r>
+        <w:rPr>
+          <w:rFonts w:ascii="Arial" w:hAnsi="Arial" w:cs="Arial"/>
+        </w:rPr>
+        <w:t xml:space="preserve"> Rolle Trainer wichtig für </w:t>
+      </w:r>
+      <w:proofErr w:type="spellStart"/>
+      <w:r>
+        <w:rPr>
+          <w:rFonts w:ascii="Arial" w:hAnsi="Arial" w:cs="Arial"/>
+        </w:rPr>
+        <w:t>fans</w:t>
+      </w:r>
+      <w:proofErr w:type="spellEnd"/>
+      <w:r>
+        <w:rPr>
+          <w:rFonts w:ascii="Arial" w:hAnsi="Arial" w:cs="Arial"/>
+        </w:rPr>
+        <w:t xml:space="preserve"> soll der </w:t>
       </w:r>
       <w:proofErr w:type="spellStart"/>
       <w:r>
@@ -193,104 +249,6 @@
         <w:rPr>
           <w:rFonts w:ascii="Arial" w:hAnsi="Arial" w:cs="Arial"/>
         </w:rPr>
-        <w:t xml:space="preserve"> Diese </w:t>
-      </w:r>
-      <w:proofErr w:type="spellStart"/>
-      <w:r>
-        <w:rPr>
-          <w:rFonts w:ascii="Arial" w:hAnsi="Arial" w:cs="Arial"/>
-        </w:rPr>
-        <w:t>auswahlmöglichkeiten</w:t>
-      </w:r>
-      <w:proofErr w:type="spellEnd"/>
-      <w:r>
-        <w:rPr>
-          <w:rFonts w:ascii="Arial" w:hAnsi="Arial" w:cs="Arial"/>
-        </w:rPr>
-        <w:t xml:space="preserve"> sollen dann in </w:t>
-      </w:r>
-      <w:proofErr w:type="spellStart"/>
-      <w:r>
-        <w:rPr>
-          <w:rFonts w:ascii="Arial" w:hAnsi="Arial" w:cs="Arial"/>
-        </w:rPr>
-        <w:t>spielplan</w:t>
-      </w:r>
-      <w:proofErr w:type="spellEnd"/>
-      <w:r>
-        <w:rPr>
-          <w:rFonts w:ascii="Arial" w:hAnsi="Arial" w:cs="Arial"/>
-        </w:rPr>
-        <w:t xml:space="preserve"> gespeichert werden Treffpunkt ist nur für Rolle </w:t>
-      </w:r>
-      <w:proofErr w:type="spellStart"/>
-      <w:r>
-        <w:rPr>
-          <w:rFonts w:ascii="Arial" w:hAnsi="Arial" w:cs="Arial"/>
-        </w:rPr>
-        <w:t>eltern</w:t>
-      </w:r>
-      <w:proofErr w:type="spellEnd"/>
-      <w:r>
-        <w:rPr>
-          <w:rFonts w:ascii="Arial" w:hAnsi="Arial" w:cs="Arial"/>
-        </w:rPr>
-        <w:t xml:space="preserve"> </w:t>
-      </w:r>
-      <w:proofErr w:type="spellStart"/>
-      <w:r>
-        <w:rPr>
-          <w:rFonts w:ascii="Arial" w:hAnsi="Arial" w:cs="Arial"/>
-        </w:rPr>
-        <w:t>undRolle</w:t>
-      </w:r>
-      <w:proofErr w:type="spellEnd"/>
-      <w:r>
-        <w:rPr>
-          <w:rFonts w:ascii="Arial" w:hAnsi="Arial" w:cs="Arial"/>
-        </w:rPr>
-        <w:t xml:space="preserve"> </w:t>
-      </w:r>
-      <w:proofErr w:type="spellStart"/>
-      <w:r>
-        <w:rPr>
-          <w:rFonts w:ascii="Arial" w:hAnsi="Arial" w:cs="Arial"/>
-        </w:rPr>
-        <w:t>spieler</w:t>
-      </w:r>
-      <w:proofErr w:type="spellEnd"/>
-      <w:r>
-        <w:rPr>
-          <w:rFonts w:ascii="Arial" w:hAnsi="Arial" w:cs="Arial"/>
-        </w:rPr>
-        <w:t xml:space="preserve"> Rolle Trainer wichtig für </w:t>
-      </w:r>
-      <w:proofErr w:type="spellStart"/>
-      <w:r>
-        <w:rPr>
-          <w:rFonts w:ascii="Arial" w:hAnsi="Arial" w:cs="Arial"/>
-        </w:rPr>
-        <w:t>fans</w:t>
-      </w:r>
-      <w:proofErr w:type="spellEnd"/>
-      <w:r>
-        <w:rPr>
-          <w:rFonts w:ascii="Arial" w:hAnsi="Arial" w:cs="Arial"/>
-        </w:rPr>
-        <w:t xml:space="preserve"> soll der </w:t>
-      </w:r>
-      <w:proofErr w:type="spellStart"/>
-      <w:r>
-        <w:rPr>
-          <w:rFonts w:ascii="Arial" w:hAnsi="Arial" w:cs="Arial"/>
-        </w:rPr>
-        <w:t>treffpunkt</w:t>
-      </w:r>
-      <w:proofErr w:type="spellEnd"/>
-      <w:r>
-        <w:rPr>
-          <w:rFonts w:ascii="Arial" w:hAnsi="Arial" w:cs="Arial"/>
-        </w:rPr>
         <w:t xml:space="preserve"> nicht ersichtlich sein. Sollen wir auch gleich die </w:t>
       </w:r>
       <w:proofErr w:type="spellStart"/>
@@ -305,21 +263,7 @@
         <w:rPr>
           <w:rFonts w:ascii="Arial" w:hAnsi="Arial" w:cs="Arial"/>
         </w:rPr>
-        <w:t xml:space="preserve"> des matchplanes besprechen so wie </w:t>
-      </w:r>
-      <w:proofErr w:type="gramStart"/>
-      <w:r>
-        <w:rPr>
-          <w:rFonts w:ascii="Arial" w:hAnsi="Arial" w:cs="Arial"/>
-        </w:rPr>
-        <w:t>Rapid</w:t>
-      </w:r>
-      <w:proofErr w:type="gramEnd"/>
-      <w:r>
-        <w:rPr>
-          <w:rFonts w:ascii="Arial" w:hAnsi="Arial" w:cs="Arial"/>
-        </w:rPr>
-        <w:t xml:space="preserve"> von </w:t>
+        <w:t xml:space="preserve"> des matchplanes besprechen so wie Rapid von </w:t>
       </w:r>
       <w:proofErr w:type="spellStart"/>
       <w:r>
@@ -361,35 +305,7 @@
         <w:rPr>
           <w:rFonts w:ascii="Arial" w:hAnsi="Arial" w:cs="Arial"/>
         </w:rPr>
-        <w:t xml:space="preserve"> der wird </w:t>
-      </w:r>
-      <w:proofErr w:type="gramStart"/>
-      <w:r>
-        <w:rPr>
-          <w:rFonts w:ascii="Arial" w:hAnsi="Arial" w:cs="Arial"/>
-        </w:rPr>
-        <w:t>bei spielanlegen</w:t>
-      </w:r>
-      <w:proofErr w:type="gramEnd"/>
-      <w:r>
-        <w:rPr>
-          <w:rFonts w:ascii="Arial" w:hAnsi="Arial" w:cs="Arial"/>
-        </w:rPr>
-        <w:t xml:space="preserve"> festgelegt und </w:t>
-      </w:r>
-      <w:proofErr w:type="gramStart"/>
-      <w:r>
-        <w:rPr>
-          <w:rFonts w:ascii="Arial" w:hAnsi="Arial" w:cs="Arial"/>
-        </w:rPr>
-        <w:t>Logo</w:t>
-      </w:r>
-      <w:proofErr w:type="gramEnd"/>
-      <w:r>
-        <w:rPr>
-          <w:rFonts w:ascii="Arial" w:hAnsi="Arial" w:cs="Arial"/>
-        </w:rPr>
-        <w:t xml:space="preserve"> diese können in entsprechenden </w:t>
+        <w:t xml:space="preserve"> der wird bei spielanlegen festgelegt und Logo diese können in entsprechenden </w:t>
       </w:r>
       <w:proofErr w:type="spellStart"/>
       <w:r>
@@ -473,90 +389,132 @@
         <w:rPr>
           <w:rFonts w:ascii="Arial" w:hAnsi="Arial" w:cs="Arial"/>
         </w:rPr>
+        <w:t xml:space="preserve"> verwenden? </w:t>
+      </w:r>
+      <w:r>
+        <w:rPr>
+          <w:rFonts w:ascii="Arial" w:hAnsi="Arial" w:cs="Arial"/>
+        </w:rPr>
+        <w:t xml:space="preserve">Meine zu und </w:t>
+      </w:r>
+      <w:proofErr w:type="spellStart"/>
+      <w:r>
+        <w:rPr>
+          <w:rFonts w:ascii="Arial" w:hAnsi="Arial" w:cs="Arial"/>
+        </w:rPr>
+        <w:t>absage</w:t>
+      </w:r>
+      <w:proofErr w:type="spellEnd"/>
+      <w:r>
+        <w:rPr>
+          <w:rFonts w:ascii="Arial" w:hAnsi="Arial" w:cs="Arial"/>
+        </w:rPr>
+        <w:t xml:space="preserve">. Ich kenne Verein da ist man automatisch dabei nur wenn jemand nicht kann muss er absagen, aber das setzt voraus dass alle </w:t>
+      </w:r>
+      <w:proofErr w:type="spellStart"/>
+      <w:r>
+        <w:rPr>
+          <w:rFonts w:ascii="Arial" w:hAnsi="Arial" w:cs="Arial"/>
+        </w:rPr>
+        <w:t>termine</w:t>
+      </w:r>
+      <w:proofErr w:type="spellEnd"/>
+      <w:r>
+        <w:rPr>
+          <w:rFonts w:ascii="Arial" w:hAnsi="Arial" w:cs="Arial"/>
+        </w:rPr>
+        <w:t xml:space="preserve"> bekannt sind, oder. </w:t>
+      </w:r>
+      <w:r>
+        <w:rPr>
+          <w:rFonts w:ascii="Arial" w:hAnsi="Arial" w:cs="Arial"/>
+        </w:rPr>
+        <w:t xml:space="preserve">Für </w:t>
+      </w:r>
+      <w:proofErr w:type="spellStart"/>
+      <w:r>
+        <w:rPr>
+          <w:rFonts w:ascii="Arial" w:hAnsi="Arial" w:cs="Arial"/>
+        </w:rPr>
+        <w:t>spieler</w:t>
+      </w:r>
+      <w:proofErr w:type="spellEnd"/>
+      <w:r>
+        <w:rPr>
+          <w:rFonts w:ascii="Arial" w:hAnsi="Arial" w:cs="Arial"/>
+        </w:rPr>
+        <w:t xml:space="preserve"> und </w:t>
+      </w:r>
+      <w:proofErr w:type="spellStart"/>
+      <w:r>
+        <w:rPr>
+          <w:rFonts w:ascii="Arial" w:hAnsi="Arial" w:cs="Arial"/>
+        </w:rPr>
+        <w:t>eltern</w:t>
+      </w:r>
+      <w:proofErr w:type="spellEnd"/>
+      <w:r>
+        <w:rPr>
+          <w:rFonts w:ascii="Arial" w:hAnsi="Arial" w:cs="Arial"/>
+        </w:rPr>
+        <w:t xml:space="preserve"> wichtig aber für </w:t>
+      </w:r>
+      <w:proofErr w:type="spellStart"/>
+      <w:r>
+        <w:rPr>
+          <w:rFonts w:ascii="Arial" w:hAnsi="Arial" w:cs="Arial"/>
+        </w:rPr>
+        <w:t>fanrolle</w:t>
+      </w:r>
+      <w:proofErr w:type="spellEnd"/>
+      <w:r>
+        <w:rPr>
+          <w:rFonts w:ascii="Arial" w:hAnsi="Arial" w:cs="Arial"/>
+        </w:rPr>
+        <w:t xml:space="preserve"> nicht ersichtlich wir haben das jetzt im </w:t>
+      </w:r>
+      <w:proofErr w:type="spellStart"/>
+      <w:r>
+        <w:rPr>
+          <w:rFonts w:ascii="Arial" w:hAnsi="Arial" w:cs="Arial"/>
+        </w:rPr>
+        <w:t>team</w:t>
+      </w:r>
+      <w:proofErr w:type="spellEnd"/>
+      <w:r>
+        <w:rPr>
+          <w:rFonts w:ascii="Arial" w:hAnsi="Arial" w:cs="Arial"/>
+        </w:rPr>
         <w:t xml:space="preserve"> </w:t>
       </w:r>
-      <w:proofErr w:type="gramStart"/>
-      <w:r>
-        <w:rPr>
-          <w:rFonts w:ascii="Arial" w:hAnsi="Arial" w:cs="Arial"/>
-        </w:rPr>
-        <w:t>verwenden?</w:t>
-      </w:r>
-      <w:proofErr w:type="gramEnd"/>
+      <w:proofErr w:type="spellStart"/>
+      <w:r>
+        <w:rPr>
+          <w:rFonts w:ascii="Arial" w:hAnsi="Arial" w:cs="Arial"/>
+        </w:rPr>
+        <w:t>menü</w:t>
+      </w:r>
+      <w:proofErr w:type="spellEnd"/>
+      <w:r>
+        <w:rPr>
+          <w:rFonts w:ascii="Arial" w:hAnsi="Arial" w:cs="Arial"/>
+        </w:rPr>
+        <w:t xml:space="preserve"> aber da ist es irgendwie versteckt wäre ein Termine menüpunkt für Eltern </w:t>
+      </w:r>
+      <w:proofErr w:type="spellStart"/>
+      <w:r>
+        <w:rPr>
+          <w:rFonts w:ascii="Arial" w:hAnsi="Arial" w:cs="Arial"/>
+        </w:rPr>
+        <w:t>trainer</w:t>
+      </w:r>
+      <w:proofErr w:type="spellEnd"/>
       <w:r>
         <w:rPr>
           <w:rFonts w:ascii="Arial" w:hAnsi="Arial" w:cs="Arial"/>
         </w:rPr>
         <w:t xml:space="preserve"> </w:t>
       </w:r>
-      <w:r>
-        <w:rPr>
-          <w:rFonts w:ascii="Arial" w:hAnsi="Arial" w:cs="Arial"/>
-        </w:rPr>
-        <w:t xml:space="preserve">Meine zu und </w:t>
-      </w:r>
-      <w:proofErr w:type="spellStart"/>
-      <w:r>
-        <w:rPr>
-          <w:rFonts w:ascii="Arial" w:hAnsi="Arial" w:cs="Arial"/>
-        </w:rPr>
-        <w:t>absage</w:t>
-      </w:r>
-      <w:proofErr w:type="spellEnd"/>
-      <w:r>
-        <w:rPr>
-          <w:rFonts w:ascii="Arial" w:hAnsi="Arial" w:cs="Arial"/>
-        </w:rPr>
-        <w:t xml:space="preserve">. Ich kenne Verein da ist man automatisch dabei nur wenn jemand nicht </w:t>
-      </w:r>
-      <w:proofErr w:type="gramStart"/>
-      <w:r>
-        <w:rPr>
-          <w:rFonts w:ascii="Arial" w:hAnsi="Arial" w:cs="Arial"/>
-        </w:rPr>
-        <w:t>kann</w:t>
-      </w:r>
-      <w:proofErr w:type="gramEnd"/>
-      <w:r>
-        <w:rPr>
-          <w:rFonts w:ascii="Arial" w:hAnsi="Arial" w:cs="Arial"/>
-        </w:rPr>
-        <w:t xml:space="preserve"> muss er absagen, aber das setzt </w:t>
-      </w:r>
-      <w:proofErr w:type="gramStart"/>
-      <w:r>
-        <w:rPr>
-          <w:rFonts w:ascii="Arial" w:hAnsi="Arial" w:cs="Arial"/>
-        </w:rPr>
-        <w:t>voraus</w:t>
-      </w:r>
-      <w:proofErr w:type="gramEnd"/>
-      <w:r>
-        <w:rPr>
-          <w:rFonts w:ascii="Arial" w:hAnsi="Arial" w:cs="Arial"/>
-        </w:rPr>
-        <w:t xml:space="preserve"> dass alle </w:t>
-      </w:r>
-      <w:proofErr w:type="spellStart"/>
-      <w:r>
-        <w:rPr>
-          <w:rFonts w:ascii="Arial" w:hAnsi="Arial" w:cs="Arial"/>
-        </w:rPr>
-        <w:t>termine</w:t>
-      </w:r>
-      <w:proofErr w:type="spellEnd"/>
-      <w:r>
-        <w:rPr>
-          <w:rFonts w:ascii="Arial" w:hAnsi="Arial" w:cs="Arial"/>
-        </w:rPr>
-        <w:t xml:space="preserve"> bekannt sind, oder. </w:t>
-      </w:r>
-      <w:r>
-        <w:rPr>
-          <w:rFonts w:ascii="Arial" w:hAnsi="Arial" w:cs="Arial"/>
-        </w:rPr>
-        <w:t xml:space="preserve">Für </w:t>
-      </w:r>
       <w:proofErr w:type="spellStart"/>
       <w:r>
         <w:rPr>
@@ -569,92 +527,6 @@
         <w:rPr>
           <w:rFonts w:ascii="Arial" w:hAnsi="Arial" w:cs="Arial"/>
         </w:rPr>
-        <w:t xml:space="preserve"> und </w:t>
-      </w:r>
-      <w:proofErr w:type="spellStart"/>
-      <w:r>
-        <w:rPr>
-          <w:rFonts w:ascii="Arial" w:hAnsi="Arial" w:cs="Arial"/>
-        </w:rPr>
-        <w:t>eltern</w:t>
-      </w:r>
-      <w:proofErr w:type="spellEnd"/>
-      <w:r>
-        <w:rPr>
-          <w:rFonts w:ascii="Arial" w:hAnsi="Arial" w:cs="Arial"/>
-        </w:rPr>
-        <w:t xml:space="preserve"> wichtig aber für </w:t>
-      </w:r>
-      <w:proofErr w:type="spellStart"/>
-      <w:r>
-        <w:rPr>
-          <w:rFonts w:ascii="Arial" w:hAnsi="Arial" w:cs="Arial"/>
-        </w:rPr>
-        <w:t>fanrolle</w:t>
-      </w:r>
-      <w:proofErr w:type="spellEnd"/>
-      <w:r>
-        <w:rPr>
-          <w:rFonts w:ascii="Arial" w:hAnsi="Arial" w:cs="Arial"/>
-        </w:rPr>
-        <w:t xml:space="preserve"> nicht ersichtlich wir haben das jetzt im </w:t>
-      </w:r>
-      <w:proofErr w:type="spellStart"/>
-      <w:r>
-        <w:rPr>
-          <w:rFonts w:ascii="Arial" w:hAnsi="Arial" w:cs="Arial"/>
-        </w:rPr>
-        <w:t>team</w:t>
-      </w:r>
-      <w:proofErr w:type="spellEnd"/>
-      <w:r>
-        <w:rPr>
-          <w:rFonts w:ascii="Arial" w:hAnsi="Arial" w:cs="Arial"/>
-        </w:rPr>
-        <w:t xml:space="preserve"> </w:t>
-      </w:r>
-      <w:proofErr w:type="spellStart"/>
-      <w:proofErr w:type="gramStart"/>
-      <w:r>
-        <w:rPr>
-          <w:rFonts w:ascii="Arial" w:hAnsi="Arial" w:cs="Arial"/>
-        </w:rPr>
-        <w:t>menü</w:t>
-      </w:r>
-      <w:proofErr w:type="spellEnd"/>
-      <w:proofErr w:type="gramEnd"/>
-      <w:r>
-        <w:rPr>
-          <w:rFonts w:ascii="Arial" w:hAnsi="Arial" w:cs="Arial"/>
-        </w:rPr>
-        <w:t xml:space="preserve"> aber da ist es irgendwie versteckt wäre ein Termine menüpunkt für Eltern </w:t>
-      </w:r>
-      <w:proofErr w:type="spellStart"/>
-      <w:r>
-        <w:rPr>
-          <w:rFonts w:ascii="Arial" w:hAnsi="Arial" w:cs="Arial"/>
-        </w:rPr>
-        <w:t>trainer</w:t>
-      </w:r>
-      <w:proofErr w:type="spellEnd"/>
-      <w:r>
-        <w:rPr>
-          <w:rFonts w:ascii="Arial" w:hAnsi="Arial" w:cs="Arial"/>
-        </w:rPr>
-        <w:t xml:space="preserve"> </w:t>
-      </w:r>
-      <w:proofErr w:type="spellStart"/>
-      <w:r>
-        <w:rPr>
-          <w:rFonts w:ascii="Arial" w:hAnsi="Arial" w:cs="Arial"/>
-        </w:rPr>
-        <w:t>spieler</w:t>
-      </w:r>
-      <w:proofErr w:type="spellEnd"/>
-      <w:r>
-        <w:rPr>
-          <w:rFonts w:ascii="Arial" w:hAnsi="Arial" w:cs="Arial"/>
-        </w:rPr>
         <w:t xml:space="preserve"> denkbar oder wie können wir diese zu und absage </w:t>
       </w:r>
       <w:proofErr w:type="spellStart"/>
@@ -675,21 +547,7 @@
         <w:rPr>
           <w:rFonts w:ascii="Arial" w:hAnsi="Arial" w:cs="Arial"/>
         </w:rPr>
-        <w:t xml:space="preserve"> ist das </w:t>
-      </w:r>
-      <w:proofErr w:type="gramStart"/>
-      <w:r>
-        <w:rPr>
-          <w:rFonts w:ascii="Arial" w:hAnsi="Arial" w:cs="Arial"/>
-        </w:rPr>
-        <w:t>ok</w:t>
-      </w:r>
-      <w:proofErr w:type="gramEnd"/>
-      <w:r>
-        <w:rPr>
-          <w:rFonts w:ascii="Arial" w:hAnsi="Arial" w:cs="Arial"/>
-        </w:rPr>
-        <w:t xml:space="preserve"> wenn wir das jetzt sauber lösen und dann zum nächsten </w:t>
+        <w:t xml:space="preserve"> ist das ok wenn wir das jetzt sauber lösen und dann zum nächsten </w:t>
       </w:r>
       <w:proofErr w:type="spellStart"/>
       <w:r>
@@ -737,7 +595,6 @@
         <w:t xml:space="preserve"> und </w:t>
       </w:r>
       <w:proofErr w:type="spellStart"/>
-      <w:proofErr w:type="gramStart"/>
       <w:r>
         <w:rPr>
           <w:b/>
@@ -758,15 +615,7 @@
           <w:b/>
           <w:bCs/>
         </w:rPr>
-        <w:t xml:space="preserve"> bei</w:t>
-      </w:r>
-      <w:proofErr w:type="gramEnd"/>
-      <w:r>
-        <w:rPr>
-          <w:b/>
-          <w:bCs/>
-        </w:rPr>
-        <w:t xml:space="preserve"> zu absage </w:t>
+        <w:t xml:space="preserve"> bei zu absage </w:t>
       </w:r>
     </w:p>
     <w:p>
@@ -795,18 +644,13 @@
       </w:r>
       <w:proofErr w:type="spellEnd"/>
       <w:r>
-        <w:t xml:space="preserve"> verknüpft ist zu oder absage danach wird der </w:t>
-      </w:r>
-      <w:proofErr w:type="gramStart"/>
-      <w:r>
-        <w:t xml:space="preserve">Spieler  </w:t>
+        <w:t xml:space="preserve"> verknüpft ist zu oder absage danach wird der Spieler  </w:t>
       </w:r>
       <w:proofErr w:type="spellStart"/>
       <w:r>
         <w:t>team</w:t>
       </w:r>
       <w:proofErr w:type="spellEnd"/>
-      <w:proofErr w:type="gramEnd"/>
       <w:r>
         <w:t xml:space="preserve"> für spiel oder Spielkader gespeichert momentan haben wir die </w:t>
       </w:r>
@@ -848,7 +692,15 @@
       </w:r>
       <w:proofErr w:type="spellEnd"/>
       <w:r>
-        <w:t xml:space="preserve">  sieht wer zum spiel zur </w:t>
+        <w:t xml:space="preserve">  sieht wer zum </w:t>
+      </w:r>
+      <w:proofErr w:type="spellStart"/>
+      <w:r>
+        <w:t>spiel</w:t>
+      </w:r>
+      <w:proofErr w:type="spellEnd"/>
+      <w:r>
+        <w:t xml:space="preserve"> zur </w:t>
       </w:r>
       <w:proofErr w:type="spellStart"/>
       <w:r>
@@ -1051,7 +903,15 @@
       </w:r>
       <w:proofErr w:type="spellEnd"/>
       <w:r>
-        <w:t xml:space="preserve"> zeit </w:t>
+        <w:t xml:space="preserve"> </w:t>
+      </w:r>
+      <w:proofErr w:type="spellStart"/>
+      <w:r>
+        <w:t>zeit</w:t>
+      </w:r>
+      <w:proofErr w:type="spellEnd"/>
+      <w:r>
+        <w:t xml:space="preserve"> </w:t>
       </w:r>
       <w:proofErr w:type="spellStart"/>
       <w:r>
@@ -1059,15 +919,7 @@
       </w:r>
       <w:proofErr w:type="spellEnd"/>
       <w:r>
-        <w:t xml:space="preserve"> Bis spiel aus ist und beendet wird. </w:t>
-      </w:r>
-      <w:proofErr w:type="gramStart"/>
-      <w:r>
-        <w:t>Alles</w:t>
-      </w:r>
-      <w:proofErr w:type="gramEnd"/>
-      <w:r>
-        <w:t xml:space="preserve"> was </w:t>
+        <w:t xml:space="preserve"> Bis spiel aus ist und beendet wird. Alles was </w:t>
       </w:r>
       <w:proofErr w:type="spellStart"/>
       <w:r>
@@ -1091,15 +943,7 @@
       </w:r>
       <w:proofErr w:type="spellEnd"/>
       <w:r>
-        <w:t xml:space="preserve"> getrennt, das ist glaube ich vom verlauf her besser </w:t>
-      </w:r>
-      <w:proofErr w:type="gramStart"/>
-      <w:r>
-        <w:t>wie</w:t>
-      </w:r>
-      <w:proofErr w:type="gramEnd"/>
-      <w:r>
-        <w:t xml:space="preserve"> jetzt. Können wir das optimieren und </w:t>
+        <w:t xml:space="preserve"> getrennt, das ist glaube ich vom verlauf her besser wie jetzt. Können wir das optimieren und </w:t>
       </w:r>
       <w:proofErr w:type="spellStart"/>
       <w:r>
@@ -1176,7 +1020,15 @@
       </w:r>
       <w:proofErr w:type="spellEnd"/>
       <w:r>
-        <w:t xml:space="preserve"> schon oben ersichtlich ist. Der block Spielort und </w:t>
+        <w:t xml:space="preserve"> schon oben ersichtlich ist. Der </w:t>
+      </w:r>
+      <w:proofErr w:type="spellStart"/>
+      <w:r>
+        <w:t>block</w:t>
+      </w:r>
+      <w:proofErr w:type="spellEnd"/>
+      <w:r>
+        <w:t xml:space="preserve"> Spielort und </w:t>
       </w:r>
       <w:proofErr w:type="spellStart"/>
       <w:r>
@@ -1235,12 +1087,10 @@
         <w:t xml:space="preserve"> </w:t>
       </w:r>
       <w:proofErr w:type="spellStart"/>
-      <w:proofErr w:type="gramStart"/>
       <w:r>
         <w:t>ect</w:t>
       </w:r>
       <w:proofErr w:type="spellEnd"/>
-      <w:proofErr w:type="gramEnd"/>
       <w:r>
         <w:t xml:space="preserve"> aber es ist nicht im </w:t>
       </w:r>
@@ -1259,6 +1109,213 @@
       <w:proofErr w:type="spellEnd"/>
       <w:r>
         <w:t xml:space="preserve"> es sich handelt das gehört passend eingefügt sodass gleich ersichtlich ist um welches spiel es sich handelt. </w:t>
+      </w:r>
+    </w:p>
+    <w:p/>
+    <w:p>
+      <w:r>
+        <w:lastRenderedPageBreak/>
+        <w:t xml:space="preserve">Menüpunkte unten: wir haben jetzt bei den </w:t>
+      </w:r>
+      <w:proofErr w:type="spellStart"/>
+      <w:r>
+        <w:t>spielern</w:t>
+      </w:r>
+      <w:proofErr w:type="spellEnd"/>
+      <w:r>
+        <w:t xml:space="preserve"> und </w:t>
+      </w:r>
+      <w:proofErr w:type="spellStart"/>
+      <w:r>
+        <w:t>eltern</w:t>
+      </w:r>
+      <w:proofErr w:type="spellEnd"/>
+      <w:r>
+        <w:t xml:space="preserve"> die menüpunkte </w:t>
+      </w:r>
+      <w:proofErr w:type="spellStart"/>
+      <w:r>
+        <w:t>termin</w:t>
+      </w:r>
+      <w:proofErr w:type="spellEnd"/>
+      <w:r>
+        <w:t xml:space="preserve"> </w:t>
+      </w:r>
+      <w:proofErr w:type="spellStart"/>
+      <w:r>
+        <w:t>kalender</w:t>
+      </w:r>
+      <w:proofErr w:type="spellEnd"/>
+      <w:r>
+        <w:t xml:space="preserve"> </w:t>
+      </w:r>
+      <w:proofErr w:type="spellStart"/>
+      <w:r>
+        <w:t>team</w:t>
+      </w:r>
+      <w:proofErr w:type="spellEnd"/>
+      <w:r>
+        <w:t xml:space="preserve"> live und </w:t>
+      </w:r>
+      <w:proofErr w:type="spellStart"/>
+      <w:r>
+        <w:t>tabelle</w:t>
+      </w:r>
+      <w:proofErr w:type="spellEnd"/>
+      <w:r>
+        <w:t xml:space="preserve"> wenn wir den </w:t>
+      </w:r>
+      <w:proofErr w:type="spellStart"/>
+      <w:r>
+        <w:t>kalender</w:t>
+      </w:r>
+      <w:proofErr w:type="spellEnd"/>
+      <w:r>
+        <w:t xml:space="preserve"> in </w:t>
+      </w:r>
+      <w:proofErr w:type="spellStart"/>
+      <w:r>
+        <w:t>team</w:t>
+      </w:r>
+      <w:proofErr w:type="spellEnd"/>
+      <w:r>
+        <w:t xml:space="preserve"> mit einem </w:t>
+      </w:r>
+      <w:proofErr w:type="spellStart"/>
+      <w:r>
+        <w:t>button</w:t>
+      </w:r>
+      <w:proofErr w:type="spellEnd"/>
+      <w:r>
+        <w:t xml:space="preserve"> integrieren würde das auch sinnvoll sein wir brauchen unbedingt einen </w:t>
+      </w:r>
+      <w:proofErr w:type="spellStart"/>
+      <w:r>
+        <w:t>home</w:t>
+      </w:r>
+      <w:proofErr w:type="spellEnd"/>
+      <w:r>
+        <w:t xml:space="preserve"> </w:t>
+      </w:r>
+      <w:proofErr w:type="spellStart"/>
+      <w:r>
+        <w:t>button</w:t>
+      </w:r>
+      <w:proofErr w:type="spellEnd"/>
+      <w:r>
+        <w:t xml:space="preserve"> in menüleiste dann </w:t>
+      </w:r>
+      <w:proofErr w:type="spellStart"/>
+      <w:r>
+        <w:t>team</w:t>
+      </w:r>
+      <w:proofErr w:type="spellEnd"/>
+      <w:r>
+        <w:t xml:space="preserve"> dann </w:t>
+      </w:r>
+      <w:proofErr w:type="spellStart"/>
+      <w:r>
+        <w:t>termine</w:t>
+      </w:r>
+      <w:proofErr w:type="spellEnd"/>
+      <w:r>
+        <w:t xml:space="preserve"> darin </w:t>
+      </w:r>
+      <w:proofErr w:type="spellStart"/>
+      <w:r>
+        <w:t>kalender</w:t>
+      </w:r>
+      <w:proofErr w:type="spellEnd"/>
+      <w:r>
+        <w:t xml:space="preserve"> integriert dann live und einen fünften </w:t>
+      </w:r>
+      <w:proofErr w:type="spellStart"/>
+      <w:r>
+        <w:t>tabelle</w:t>
+      </w:r>
+      <w:proofErr w:type="spellEnd"/>
+      <w:r>
+        <w:t xml:space="preserve"> brauchen wir nicht oder wir können </w:t>
+      </w:r>
+      <w:proofErr w:type="spellStart"/>
+      <w:r>
+        <w:t>news</w:t>
+      </w:r>
+      <w:proofErr w:type="spellEnd"/>
+      <w:r>
+        <w:t xml:space="preserve"> machen oder </w:t>
+      </w:r>
+      <w:proofErr w:type="spellStart"/>
+      <w:r>
+        <w:t>wass</w:t>
+      </w:r>
+      <w:proofErr w:type="spellEnd"/>
+      <w:r>
+        <w:t xml:space="preserve"> fällt dir ein oder machen wir </w:t>
+      </w:r>
+      <w:proofErr w:type="spellStart"/>
+      <w:r>
+        <w:t>home</w:t>
+      </w:r>
+      <w:proofErr w:type="spellEnd"/>
+      <w:r>
+        <w:t xml:space="preserve"> zu </w:t>
+      </w:r>
+      <w:proofErr w:type="spellStart"/>
+      <w:r>
+        <w:t>news</w:t>
+      </w:r>
+      <w:proofErr w:type="spellEnd"/>
+      <w:r>
+        <w:t xml:space="preserve"> mir schwebt sowas vor wie bei </w:t>
+      </w:r>
+      <w:proofErr w:type="spellStart"/>
+      <w:r>
+        <w:t>facebook</w:t>
+      </w:r>
+      <w:proofErr w:type="spellEnd"/>
+      <w:r>
+        <w:t xml:space="preserve"> unter </w:t>
+      </w:r>
+      <w:proofErr w:type="spellStart"/>
+      <w:r>
+        <w:t>news</w:t>
+      </w:r>
+      <w:proofErr w:type="spellEnd"/>
+      <w:r>
+        <w:t xml:space="preserve"> können wir </w:t>
+      </w:r>
+      <w:proofErr w:type="spellStart"/>
+      <w:r>
+        <w:t>feeds</w:t>
+      </w:r>
+      <w:proofErr w:type="spellEnd"/>
+      <w:r>
+        <w:t xml:space="preserve"> machen wie heute </w:t>
+      </w:r>
+      <w:proofErr w:type="spellStart"/>
+      <w:r>
+        <w:t>matchday</w:t>
+      </w:r>
+      <w:proofErr w:type="spellEnd"/>
+      <w:r>
+        <w:t xml:space="preserve"> </w:t>
+      </w:r>
+      <w:proofErr w:type="spellStart"/>
+      <w:r>
+        <w:t>ect</w:t>
+      </w:r>
+      <w:proofErr w:type="spellEnd"/>
+      <w:r>
+        <w:t xml:space="preserve"> oder machen wir das in </w:t>
+      </w:r>
+      <w:proofErr w:type="spellStart"/>
+      <w:r>
+        <w:t>home</w:t>
+      </w:r>
+      <w:proofErr w:type="spellEnd"/>
+      <w:r>
+        <w:t xml:space="preserve"> ? </w:t>
       </w:r>
     </w:p>
     <w:sectPr>

</xml_diff>

<commit_message>
finalize push ui add unsubscribe and test push
</commit_message>
<xml_diff>
--- a/Beschreibung-Spielapp-ideen.docx
+++ b/Beschreibung-Spielapp-ideen.docx
@@ -1316,6 +1316,33 @@
       <w:proofErr w:type="spellEnd"/>
       <w:r>
         <w:t xml:space="preserve"> ? </w:t>
+      </w:r>
+      <w:r>
+        <w:t xml:space="preserve">oder wir können auch einen </w:t>
+      </w:r>
+      <w:proofErr w:type="spellStart"/>
+      <w:r>
+        <w:t>shop</w:t>
+      </w:r>
+      <w:proofErr w:type="spellEnd"/>
+      <w:r>
+        <w:t xml:space="preserve"> integrieren weil wir jetzt </w:t>
+      </w:r>
+      <w:proofErr w:type="spellStart"/>
+      <w:r>
+        <w:t>hoodies</w:t>
+      </w:r>
+      <w:proofErr w:type="spellEnd"/>
+      <w:r>
+        <w:t xml:space="preserve"> ct verkaufen aber nur einfach dass ich mail bekomme wer was bestellt. Mehr wie 5 </w:t>
+      </w:r>
+      <w:proofErr w:type="spellStart"/>
+      <w:r>
+        <w:t>buttons</w:t>
+      </w:r>
+      <w:proofErr w:type="spellEnd"/>
+      <w:r>
+        <w:t xml:space="preserve"> sollten es nicht sein in menüleiste oder? </w:t>
       </w:r>
     </w:p>
     <w:sectPr>

</xml_diff>